<commit_message>
Add training results and summaries for ResNet models
- Created split_manifest.json to manage dataset splits.
- Added summary.json containing detailed performance metrics for ResNet18, ResNet50, and ResNet101 models, including validation and test results.
- Included training.log with comprehensive training logs, model configurations, and epoch-wise performance metrics.
</commit_message>
<xml_diff>
--- a/LAB1_315553010_楊敦傑.docx
+++ b/LAB1_315553010_楊敦傑.docx
@@ -122,35 +122,31 @@
         <w:rPr>
           <w:lang w:eastAsia="zh-TW"/>
         </w:rPr>
-        <w:t xml:space="preserve">胸部 X 光影像分類的目標為區分正常與肺炎。本作業要求自訂影像資料載入、至少兩種 </w:t>
+        <w:t>胸部 X 光影像分類的目標為區分正常與肺炎。本實驗在相同資料切分與訓練設定下比較 ResNet18、ResNet50 與 ResNet101，檢查增加網路深度是否改善測試表現，並分析誤判集中在哪一類影像。透過訓練與測試曲線、肺炎 F1 及混淆矩陣，除了比較最高成績，也觀察驗證選出的模型能否維持測試表現。ResNet18 提供參數較少的比較基準，ResNet50 與 ResNet101 則提供不同深度及容量的對照。</w:t>
       </w:r>
       <w:proofErr w:type="spellStart"/>
       <w:r>
         <w:rPr>
           <w:lang w:eastAsia="zh-TW"/>
         </w:rPr>
-        <w:t>ResNet</w:t>
       </w:r>
       <w:proofErr w:type="spellEnd"/>
       <w:r>
         <w:rPr>
           <w:lang w:eastAsia="zh-TW"/>
         </w:rPr>
-        <w:t>、逐輪準確率及 F1 曲線，並以混淆矩陣呈現測試結果。</w:t>
       </w:r>
       <w:proofErr w:type="spellStart"/>
       <w:r>
         <w:rPr>
           <w:lang w:eastAsia="zh-TW"/>
         </w:rPr>
-        <w:t>ResNet</w:t>
       </w:r>
       <w:proofErr w:type="spellEnd"/>
       <w:r>
         <w:rPr>
           <w:lang w:eastAsia="zh-TW"/>
         </w:rPr>
-        <w:t xml:space="preserve"> 的殘差捷徑使較深網路更容易最佳化。本實驗以 ResNet18、ResNet50 與 ResNet101 比較網路深度、計算成本及測試表現。</w:t>
       </w:r>
     </w:p>
     <w:p>
@@ -751,7 +747,13 @@
         <w:rPr>
           <w:lang w:eastAsia="zh-TW"/>
         </w:rPr>
-        <w:t>訓練影像縮放至 224 × 224，再施加 ±7° 旋轉、最多 3% 平移、0.95 至 1.05 倍縮放，以及最多 10% 的亮度與對比變動。驗證與測試影像只縮放，不做隨機增強。所有影像以 ImageNet 均值及標準差正規化。</w:t>
+        <w:t>訓練影像依序縮放至 224 × 224，施加 RandomAffine 的 ±7° 旋轉、最多 3% 平移與 0.95 至 1.05 倍縮放，再以 ColorJitter 調整亮度及對比，各在原值 0.9 至 1.1 倍範圍內取樣。ToTensor 將 RGB 值轉為 0 至 1，接著以 ImageNet mean = [0.485, 0.456, 0.406]、std = [0.229, 0.224, 0.225] 正規化。驗證與測試只做相同尺寸縮放、張量轉換及正規化，不使用隨機增強。</w:t>
+      </w:r>
+    </w:p>
+    <w:p>
+      <w:pPr/>
+      <w:r>
+        <w:t>DataLoader 設定為 batch_size = 32、num_workers = 2，三個分區均啟用 pin_memory。僅訓練集 shuffle = True，驗證與測試維持固定順序；drop_last = False，保留最後不足一個 batch 的影像。訓練集沒有另外使用過採樣器。影像與標籤以 non_blocking 方式搬移到 CUDA GPU。</w:t>
       </w:r>
     </w:p>
     <w:p>
@@ -772,21 +774,22 @@
         </w:rPr>
       </w:pPr>
       <w:r>
-        <w:t xml:space="preserve">ResNet18 使用 basic block，ResNet50 與 ResNet101 使用 bottleneck block。三者均由 torchvision 載入 ImageNet </w:t>
+        <w:t>ResNet18 使用 BasicBlock，每個區塊含兩個 3 × 3 卷積，四個 stage 的區塊數為 [2, 2, 2, 2]；ResNet50 與 ResNet101 使用 1 × 1、3 × 3、1 × 1 卷積構成的 Bottleneck，區塊數分別為 [3, 4, 6, 3] 與 [3, 4, 23, 3]。殘差分支與捷徑相加，尺寸或通道數改變時以投影捷徑對齊。最後經全域平均池化與二類全連接層輸出 logits，再以 argmax 決定預測類別。</w:t>
       </w:r>
       <w:proofErr w:type="spellStart"/>
-      <w:r>
-        <w:t>預訓練權重，再重新初始化二類分類層</w:t>
-      </w:r>
+      <w:r/>
       <w:proofErr w:type="spellEnd"/>
-      <w:r>
-        <w:t>。</w:t>
-      </w:r>
+      <w:r/>
       <w:r>
         <w:rPr>
           <w:lang w:eastAsia="zh-TW"/>
         </w:rPr>
-        <w:t>訓練時凍結前段卷積、layer1 與 layer2，微調 layer3、layer4 與分類層。ResNet101 讓深度相對 ResNet18 大幅增加，可檢驗較深模型是否帶來實際收益；較深不保證較準。</w:t>
+      </w:r>
+    </w:p>
+    <w:p>
+      <w:pPr/>
+      <w:r>
+        <w:t>本次確實使用 torchvision ImageNet 預訓練權重，版本列於下表。ResNet18 的分類層改為 512 → 2，ResNet50 與 ResNet101 改為 2048 → 2，分類層皆重新初始化。訓練時凍結 conv1、bn1、layer1 與 layer2，並維持凍結區段的 BatchNorm 為 eval 模式；只更新 layer3、layer4 與 fc。這是部分微調的遷移學習設定。</w:t>
       </w:r>
     </w:p>
     <w:tbl>
@@ -1448,7 +1451,7 @@
     </w:p>
     <w:p>
       <w:r>
-        <w:t>預訓練核對：修正實驗的三個交付權重，凍結 conv1 均與對應 torchvision ImageNet 權重逐元素完全相同，分類層均輸出 2 類。紀錄見 results/corrected_group_split_20261002/pretrained_verification.json。</w:t>
+        <w:t>預訓練核對：修正實驗的三個交付權重，凍結 conv1 均與對應 torchvision ImageNet 權重逐元素完全相同，分類層均輸出 2 類。紀錄見 result/pretrained_verification.json。</w:t>
       </w:r>
     </w:p>
     <w:p>
@@ -1466,7 +1469,7 @@
         </w:rPr>
       </w:pPr>
       <w:r>
-        <w:t>三個模型均在 Python 內建 venv 與 NVIDIA GeForce RTX 4070 上訓練，使用 PyTorch 2.11.0+cu128、torchvision 0.26.0+cu128、CUDA 12.8。每個模型訓練 12 輪、batch size 32，以訓練類別比例的倒數計算加權交叉熵，使用 AdamW 學習率 1 × 10⁻⁴、weight decay 1 × 10⁻⁴、cosine 學習率衰減與 CUDA 混合精度。每輪記錄訓練、驗證及測試指標，僅以驗證集肺炎 F1 選擇保存權重。 每個模型開始前重設相同隨機種子，停用 cuDNN benchmark 並啟用 deterministic 設定；這可減少執行差異，但不保證跨版本或硬體逐位元一致。</w:t>
+        <w:t>三個模型均在 Python 內建 venv 與 NVIDIA GeForce RTX 4070 上訓練，使用 Python 3.12.14、PyTorch 2.11.0+cu128、torchvision 0.26.0+cu128 與 CUDA 12.8。每個模型訓練 12 輪，以 AdamW 更新可訓練參數，初始學習率 1 × 10⁻⁴、weight decay 1 × 10⁻⁴；CosineAnnealingLR 的 T_max 為 12，每輪後更新學習率，並使用 CUDA float16 自動混合精度及 GradScaler。</w:t>
       </w:r>
       <w:proofErr w:type="spellStart"/>
       <w:r/>
@@ -1480,6 +1483,18 @@
         <w:rPr>
           <w:lang w:eastAsia="zh-TW"/>
         </w:rPr>
+      </w:r>
+    </w:p>
+    <w:p>
+      <w:pPr/>
+      <w:r>
+        <w:t>加權交叉熵以訓練集計算 w_c = N／(2N_c)，NORMAL 與 PNEUMONIA 權重分別約為 1.9447 與 0.6730。每輪完成後評估驗證與測試集，以最高驗證肺炎 F1 保存權重，分數完全相同時保留較早輪次；跨模型比較也以驗證 F1 作為選擇依據。逐輪測試成績用於作業圖表，未作為本次權重或超參數選擇依據。</w:t>
+      </w:r>
+    </w:p>
+    <w:p>
+      <w:pPr/>
+      <w:r>
+        <w:t>每個模型開始前重設 Python、NumPy、PyTorch 及 CUDA 的種子 315553010，停用 cuDNN benchmark 並啟用 deterministic 設定。三者使用同一份分組切分清單；這可減少隨機執行差異，但不保證跨硬體或套件版本逐位元一致。</w:t>
       </w:r>
     </w:p>
     <w:p>
@@ -1508,6 +1523,12 @@
           <w:lang w:eastAsia="zh-TW"/>
         </w:rPr>
         <w:t>驗證選模後的測試結果</w:t>
+      </w:r>
+    </w:p>
+    <w:p>
+      <w:pPr/>
+      <w:r>
+        <w:t>指標定義以 PNEUMONIA 為正類。TP 為正確判為肺炎，TN 為正確判為正常，FP 為正常誤判成肺炎，FN 為肺炎誤判成正常。Accuracy = (TP + TN)／N，precision = TP／(TP + FP)，recall = TP／(TP + FN)，F1 = 2TP／(2TP + FP + FN)，specificity = TN／(TN + FP)。本文 F1 為肺炎的二元 F1，並非 macro F1。</w:t>
       </w:r>
     </w:p>
     <w:tbl>
@@ -3312,7 +3333,7 @@
         <w:rPr>
           <w:lang w:eastAsia="zh-TW"/>
         </w:rPr>
-        <w:t>圖 5　各模型最高觀察測試準確率輪次的混淆矩陣。橫軸為預測，縱軸為實際。</w:t>
+        <w:t>圖 5　各模型最高測試準確率輪次的混淆矩陣熱圖，橫軸為預測、縱軸為實際。ResNet101 第 3 與第 9 輪同為 91.35%，此圖依最早達成輪次顯示第 3 輪。</w:t>
       </w:r>
     </w:p>
     <w:p>
@@ -3390,25 +3411,19 @@
         <w:pStyle w:val="21"/>
       </w:pPr>
       <w:r>
-        <w:t>資料來源與切分修正</w:t>
+        <w:t>模型排名取決於評估方式</w:t>
       </w:r>
     </w:p>
     <w:p>
       <w:pPr/>
       <w:r>
-        <w:t>本次重新下載指定 Kaggle 資料集第 2 版，逐檔核對相對路徑、檔案大小及 ZIP CRC32；本機 5856 張影像全部吻合，沒有漏檔或多餘影像。資料卡文字寫 5863 張，與實際可下載的 5856 張影像不同，不能據此判定本機資料不足。原始資料中有 30 組位元組完全相同的影像，均未跨官方 train／val／test 分區；解碼為 RGB 後另查得 30 組相同像素影像。</w:t>
+        <w:t>本次實驗顯示，模型的排名會隨評估方式改變。依各模型最高驗證 F1 保存權重後，測試結果為：ResNet18 accuracy 85.58%、F1 0.8963；ResNet50 accuracy 87.66%、F1 0.9097；ResNet101 accuracy 89.26%、F1 0.9207。跨模型以驗證 F1 選擇的也是 ResNet101。然而，圖 1 的逐輪最高測試準確率由 ResNet50 取得，為 93.27%。因此，本次結果支持 ResNet101 在既定驗證選模程序下表現較佳，尚不足以推論網路越深就一定越準。</w:t>
       </w:r>
     </w:p>
     <w:p>
       <w:pPr/>
       <w:r>
-        <w:t>原始訓練集的重複影像屬資料本身的問題，但先前逐張分層隨機切分，將其中 9 組完全相同影像分到訓練與驗證集，是本專案切分方法的疏漏。此次保留全部原始影像，將同一檔名組、相同檔案雜湊及相同解碼像素以連通分組合併，再依類別抽取驗證組；官方 val 保留在驗證集，官方 test 的 624 張影像完整保留。修正後三分區之間的檔名組、檔案雜湊與解碼像素雜湊重疊均為 0。</w:t>
-      </w:r>
-    </w:p>
-    <w:p>
-      <w:pPr/>
-      <w:r>
-        <w:t>肺炎檔名的 person 數字會在 bacteria 與 virus 命名範圍重用，所以單看數字重疊不能判定同一病患。本次以 person 編號加病原類型為檔名組；正常影像則依 IM 或 NORMAL2-IM 序號分組。這可避免同一已知影像序列跨訓練與驗證，但資料沒有經核實的臨床病患識別碼，因此仍不能宣稱已證實病患層級完全獨立。</w:t>
+        <w:t>由圖 6 可見，ResNet101 相較 ResNet50 多判對 10 張測試影像，accuracy 增加 1.60 個百分點，F1 增加 0.0110。其中正常影像的 FP 從 75 降至 66，肺炎影像的 FN 從 2 降至 1，總錯誤從 77 變為 67。這次差異主要來自減少正常影像誤判；但只有一個訓練種子與一份切分，仍需重複實驗才能判斷差異是否穩定。</w:t>
       </w:r>
     </w:p>
     <w:p>
@@ -3416,19 +3431,25 @@
         <w:pStyle w:val="21"/>
       </w:pPr>
       <w:r>
-        <w:t>模型表現與計算成本</w:t>
+        <w:t>訓練曲線改善未同步反映在測試表現</w:t>
       </w:r>
     </w:p>
     <w:p>
       <w:pPr/>
       <w:r>
-        <w:t>修正切分後，各模型依驗證 F1 選定權重的測試結果為：ResNet18 第 9 輪，accuracy 85.58%、F1 0.8963；ResNet50 第 10 輪，accuracy 87.66%、F1 0.9097；ResNet101 第 7 輪，accuracy 89.26%、F1 0.9207。逐輪最高測試準確率則為 ResNet18 92.79%（第 2 輪）、ResNet50 93.27%（第 2 輪）、ResNet101 91.35%（第 3 輪）。最高觀察值反映多次評估中的最大值，交付權重仍只依驗證 F1 決定，不能把兩者當成同一成績。</w:t>
+        <w:t>圖 2 與圖 3 顯示，三個模型的訓練指標很快接近飽和。第 12 輪的訓練／測試準確率依序為 ResNet18 99.82%／85.74%、ResNet50 99.89%／87.82%、ResNet101 99.93%／89.42%。ResNet18 與 ResNet50 在第 2 輪已達到各自最高測試準確率，繼續訓練並未維持該高點。這與過度擬合或訓練與測試分布差異相容；目前的紀錄無法單獨確認哪一項因素主導。訓練指標是在隨機增強及逐 batch 更新中累計，測試指標則使用輪末權重，因此兩條曲線也不是完全相同條件下的評估。</w:t>
       </w:r>
     </w:p>
     <w:p>
       <w:pPr/>
       <w:r>
-        <w:t>以各模型驗證選定權重的測試結果描述，ResNet101 準確率最高，比次高的 ResNet50 多判對 10 張，差 1.60 個百分點。三者總參數約 1118 萬、2351 萬與 4250 萬，本次 12 輪耗時分別為 8.7 分鐘、8.7 分鐘、8.7 分鐘。本次三者耗時差距很小；此為包含資料讀取、訓練、驗證、測試與圖表輸出的整體時間，尚未分解純 GPU 運算與其他成本，不能據此認定更深網路具有相同計算成本。成績也只來自單次實驗。ResNet18 使用 ImageNet V1 權重，ResNet50 與 ResNet101 使用 V2，且可微調參數量不同，因此無法將差異完全歸因於深度；本次沒有從零訓練對照，不能量化預訓練本身的改善幅度。</w:t>
+        <w:t>以 ResNet50 為例，第 2 輪測試 accuracy 為 93.27%，FP 為 31、FN 為 11；驗證選出的第 10 輪則為 87.66%，FP 為 75、FN 為 2。後期少漏判 9 張肺炎影像，同時多誤判 44 張正常影像，使總錯誤增加 35 張。這說明曲線的落差與兩類錯誤的取捨有關，不能只用『訓練更久』解釋成效。第 2 輪驗證 F1 為 0.9631，低於第 10 輪的 0.9880，所以原定選模規則不會保留第 2 輪。</w:t>
+      </w:r>
+    </w:p>
+    <w:p>
+      <w:pPr/>
+      <w:r>
+        <w:t>ResNet101 的最高測試準確率 91.35% 同時出現在第 3 與第 9 輪，圖 5 依先出現的第 3 輪繪製熱圖。兩輪總錯誤皆為 54 張，但 FP／FN 由 50／4 變為 52／2，肺炎 F1 因而從 0.9346 變為 0.9349。這也解釋了為何最高準確率與最高 F1 的輪次可能不同。以上最高值用於呈現作業要求；它們是多次測試觀察的最大值，具有樂觀偏差，不能取代驗證選模後的成績。</w:t>
       </w:r>
     </w:p>
     <w:p>
@@ -3436,19 +3457,19 @@
         <w:pStyle w:val="21"/>
       </w:pPr>
       <w:r>
-        <w:t>曲線與驗證選模的限制</w:t>
+        <w:t>主要錯誤集中在正常影像的假陽性</w:t>
       </w:r>
     </w:p>
     <w:p>
       <w:pPr/>
       <w:r>
-        <w:t>在驗證選定輪次，訓練與測試準確率的差距分別為 ResNet18 14.15 個百分點、ResNet50 12.16 個百分點、ResNet101 10.58 個百分點；第 12 輪的訓練／測試準確率分別為 ResNet18 99.82%／85.74%、ResNet50 99.89%／87.82%、ResNet101 99.93%／89.42%。訓練指標是在隨機增強與逐 batch 更新過程中累計，測試則以輪末權重在未增強影像上計算，兩者推論條件不同。若訓練曲線持續改善而測試沒有同步改善，與過度擬合或資料分布差異相容，但本次未做控制實驗，無法分辨各原因的影響。</w:t>
+        <w:t>圖 6 中，三個模型的肺炎 recall 均超過 99%，但正常影像的 specificity 明顯較低，依序為 ResNet18 61.97%、ResNet50 67.95%、ResNet101 71.79%。ResNet101 的 67 個錯誤中有 66 個為假陽性，亦即 234 張正常影像中仍有 28.21% 被判成肺炎。因此，本次最需要改善的是正常影像辨識，同時觀察降低假陽性是否會增加肺炎漏判。</w:t>
       </w:r>
     </w:p>
     <w:p>
       <w:pPr/>
       <w:r>
-        <w:t>修正後各模型最高驗證 F1 為 ResNet18 0.9889、ResNet50 0.9880、ResNet101 0.9897，對應測試 F1 為 0.8963、0.9097、0.9207。驗證 F1 與官方測試 F1 仍有落差，顯示驗證改善未完全轉移到官方測試集。此次同時修正切分成員與隨機執行設定，沒有只改切分的控制實驗，因此無法量化資料洩漏造成的影響。正式報告以本次分組切分實驗為準。</w:t>
+        <w:t>本報告的 F1 以肺炎為正類，沒有直接納入真陰性 TN。ResNet101 的肺炎 F1 雖達 0.9207，仍需搭配 specificity 71.79% 解讀正常影像的表現。加權交叉熵已補償訓練類別數量差異，但本次沒有未加權損失的對照實驗，不能據此認定類別權重造成或改善了目前的假陽性。</w:t>
       </w:r>
     </w:p>
     <w:p>
@@ -3456,19 +3477,19 @@
         <w:pStyle w:val="21"/>
       </w:pPr>
       <w:r>
-        <w:t>混淆矩陣與類別辨識</w:t>
+        <w:t>驗證集與測試集的落差需要逐類別檢查</w:t>
       </w:r>
     </w:p>
     <w:p>
       <w:pPr/>
       <w:r>
-        <w:t>驗證選模後的錯誤為 ResNet18：FP 89、FN 1，肺炎 recall 99.74%，正常 specificity 61.97%；ResNet50：FP 75、FN 2，肺炎 recall 99.49%，正常 specificity 67.95%；ResNet101：FP 66、FN 1，肺炎 recall 99.74%，正常 specificity 71.79%。FP 表示正常影像被判為肺炎，FN 表示肺炎被漏判。相較 ResNet50，ResNet101 的 FP 從 75 變為 66，FN 從 2 變為 1，總錯誤從 77 變為 67，與多判對 10 張的 accuracy 差異一致。結合 precision、recall 與 specificity，可判斷較高 accuracy 是否改善兩類辨識，或只是改變兩種錯誤的取捨。</w:t>
+        <w:t>三個模型最高驗證 F1 介於 0.9880 至 0.9897，對應的測試 F1 卻介於 0.8963 至 0.9207。以 ResNet101 第 7 輪為例，驗證集 209 張正常影像沒有誤判，測試集 234 張正常影像卻有 66 張被判為肺炎；相對地，肺炎 FN 由驗證集的 12／589 變為測試集的 1／390。這顯示落差不只存在於總分，也反映在各類別的錯誤率，值得進一步比對兩個分區的影像內容與來源。</w:t>
       </w:r>
     </w:p>
     <w:p>
       <w:pPr/>
       <w:r>
-        <w:t>驗證集 NORMAL 比例為 26.19%，官方測試集則為 37.50%。當正常與肺炎的錯誤率不同，類別比例改變會改變整體 accuracy；類別比例本身並不證明假陽性率增加。此處 F1 以 PNEUMONIA 為正類，並非 macro F1，較高的肺炎 F1 不代表正常影像也同樣容易辨識。加權交叉熵依訓練類別比例設定權重，但沒有類別權重的對照實驗，尚不能認定它是錯誤取捨的原因。</w:t>
+        <w:t>驗證集正常影像比例為 26.19%，測試集為 37.50%，比例改變會影響整體 accuracy 及肺炎 F1；但僅靠比例差異，無法解釋正常影像假陽性率從 0／209 變為 66／234。影像品質、拍攝條件或樣本組成不同都是待檢驗的可能原因。本次尚未逐張分析誤判影像，也未進行分布差異的控制實驗，因此不將任何一項原因寫成已確認的結論。</w:t>
       </w:r>
     </w:p>
     <w:p>
@@ -3476,19 +3497,71 @@
         <w:pStyle w:val="21"/>
       </w:pPr>
       <w:r>
-        <w:t>後續改善方向</w:t>
+        <w:t>切分修正提高了驗證的可信度</w:t>
       </w:r>
     </w:p>
     <w:p>
       <w:pPr/>
       <w:r>
-        <w:t>本次錯誤主要集中在正常影像的假陽性，後續可先檢視錯誤影像的曝光、尺寸、邊框與標籤，再在分組驗證集比較學習率、解凍範圍、較保守的增強及類別權重。分類閾值應僅由驗證集選擇，並同時檢查 precision、recall 與 specificity，以了解降低 FP 是否增加 FN。重複多個訓練種子及分組切分，可用平均值與變異判斷目前僅數張影像的模型差距是否穩定；若有可信病患資料與外部資料集，應再檢查病患獨立性與跨來源泛化。這些改善尚未實測，不能承諾提升幅度。</w:t>
+        <w:t>本機 5856 張影像的相對路徑、檔案大小及 CRC32 均符合指定 Kaggle 第 2 版下載檔，資料來源核對未發現漏檔或多檔。原始資料有 30 組完全相同檔案；以解碼 RGB 像素檢查，也有 30 組重複。兩種檢查描述的重複組不能相加計算。這些重複原本均位於同一官方分區，先前逐張隨機切分卻讓 9 組相同影像同時進入訓練與驗證，可能使驗證結果偏樂觀。</w:t>
       </w:r>
     </w:p>
     <w:p>
       <w:pPr/>
       <w:r>
-        <w:t>本次依作業要求保留每輪測試曲線，測試資料沒有參與梯度更新、模型權重選擇或本次超參數調整。不過，反覆觀察同一測試集及報告最高值仍有多次比較的樂觀偏差；本研究採單次種子、單一公開來源，也不能作出統計顯著性或臨床效能的結論。</w:t>
+        <w:t>修正後保留所有原始影像，以檔名組、檔案雜湊與解碼像素雜湊建立連通分組，再整組分配至訓練或驗證，並保留官方測試集。跨分區的檔名組、檔案雜湊與像素雜湊重疊均為 0，排除了本次可檢查到的相同影像跨區問題。肺炎 person 編號會在 bacteria 與 virus 命名範圍重用，因此分組包含病原類型；由於缺少核實的臨床病患識別碼與近似影像檢查，仍不能宣稱所有病患或近似影像完全獨立。</w:t>
+      </w:r>
+    </w:p>
+    <w:p>
+      <w:pPr/>
+      <w:r>
+        <w:t>此次重跑同時修正切分成員及隨機執行設定，並非只改一個因素的控制實驗，因此不以新舊分數差異估計資料洩漏的影響幅度。即使相同影像的跨區問題已排除，驗證與測試仍有明顯落差，顯示分組檢查是評估可信度的一部分，無法單獨保證測試表現。</w:t>
+      </w:r>
+    </w:p>
+    <w:p>
+      <w:pPr>
+        <w:pStyle w:val="21"/>
+      </w:pPr>
+      <w:r>
+        <w:t>模型深度與預訓練的效益需要控制條件比較</w:t>
+      </w:r>
+    </w:p>
+    <w:p>
+      <w:pPr/>
+      <w:r>
+        <w:t>選擇 ResNet18 作為參數較少的基準，ResNet50 作為中間深度比較，ResNet101 則用來檢查增加模型容量是否有收益。三者總參數約 1118 萬、2351 萬與 4250 萬。ResNet101 的參數約為 ResNet50 的 1.81 倍，本次驗證選模後 accuracy 增加 1.60 個百分點；是否值得使用較大模型，還需要量測推論時間與 GPU 記憶體，不能只依本次分數判斷。</w:t>
+      </w:r>
+    </w:p>
+    <w:p>
+      <w:pPr/>
+      <w:r>
+        <w:t>三個模型各訓練 12 輪，紀錄耗時依序為 ResNet18 522.8 秒、ResNet50 522.6 秒、ResNet101 524.1 秒。本次三者耗時差距很小，但計時包含資料讀取、訓練、驗證、測試、權重保存與圖表輸出，並非純 GPU 計算或推論速度。預訓練讓本次微調可從已有影像特徵開始，凍結前段則限制需更新的參數；由於沒有從零訓練對照，無法量化這些設計各自的改善幅度。另因 ResNet18 使用 ImageNet V1，ResNet50 與 ResNet101 使用 V2，模型間的結果差異不能完全歸因於深度。</w:t>
+      </w:r>
+    </w:p>
+    <w:p>
+      <w:pPr>
+        <w:pStyle w:val="21"/>
+      </w:pPr>
+      <w:r>
+        <w:t>依照錯誤型態安排後續實驗</w:t>
+      </w:r>
+    </w:p>
+    <w:p>
+      <w:pPr/>
+      <w:r>
+        <w:t>後續應先抽查正常影像的假陽性，比較其曝光、尺寸、邊框與標籤，找出可驗證的差異，再於分組驗證集一次改動一項設定，例如學習率、解凍範圍、增強幅度或類別權重。所有比較均應同時記錄肺炎 recall 與正常 specificity，確認準確率的改變是來自哪一類錯誤，而非只追求單一 F1 數值。</w:t>
+      </w:r>
+    </w:p>
+    <w:p>
+      <w:pPr/>
+      <w:r>
+        <w:t>若調整分類閾值或加入早停，選擇依據仍須來自驗證集。由於本次驗證與測試的錯誤型態不同，這些方法能否改善測試表現仍需驗證，不能直接把測試表現最高的第 2 輪當作新的早停規則。接著應以多個訓練種子與分組切分報告平均值及變異；取得可信病患識別資料與外部資料後，再檢查病患獨立性與跨來源表現。</w:t>
+      </w:r>
+    </w:p>
+    <w:p>
+      <w:pPr/>
+      <w:r>
+        <w:t>本次測試集未參與梯度更新、權重選擇或訓練超參數調整，但已依作業要求逐輪觀察，也用於本節的錯誤分析。若未來依這些觀察調整方法，應另保留未曾參與設計決策的資料作最終評估。這次的結論限於此公開資料集、單次訓練與既定切分；目前的改善方向均尚未實測，亦不能據此推論統計顯著性或臨床效能。</w:t>
       </w:r>
     </w:p>
     <w:p>
@@ -3521,7 +3594,7 @@
         <w:rPr>
           <w:lang w:eastAsia="zh-TW"/>
         </w:rPr>
-        <w:t>待本人確認內容、建立 Git 儲存庫並自行推送後填入：____________________________</w:t>
+        <w:t>GitHub 儲存庫網址　待推送後填入：____________________________</w:t>
       </w:r>
     </w:p>
     <w:p>

</xml_diff>

<commit_message>
Add .gitattributes for manifest consistency and include LAB1 report PDF
</commit_message>
<xml_diff>
--- a/LAB1_315553010_楊敦傑.docx
+++ b/LAB1_315553010_楊敦傑.docx
@@ -3260,7 +3260,7 @@
         <w:rPr>
           <w:lang w:eastAsia="zh-TW"/>
         </w:rPr>
-        <w:t>圖 1　修正實驗結果頁的實際截圖，包含各模型最高觀察測試成績、原始日誌行及驗證選模成績。</w:t>
+        <w:t>圖 1　summary.json 的實際截圖，包含三模型依驗證 F1 選模後的測試成績，以及逐輪最高測試準確率與肺炎 F1。</w:t>
       </w:r>
     </w:p>
     <w:p>
@@ -3662,20 +3662,18 @@
         <w:rPr>
           <w:lang w:eastAsia="zh-TW"/>
         </w:rPr>
-        <w:t>本次實驗顯示，模型的排名會隨評估方式改變。依各模型最高驗證 F1 保存權重後，測試結果為：ResNet18 accuracy 85.58%、F1 0.8963；ResNet50 accuracy 87.66%、F1 0.9097；ResNet101 accuracy 89.26%、F1 0.9207。跨模型以驗證 F1 選擇的也是 ResNet101。然而，圖 1 的逐輪最高測試準確率由 ResNet50 取得，為 93.27%。因此，本次結果支持 ResNet101 在既定驗證選模程序下表現較佳，</w:t>
+        <w:t>本次實驗顯示，模型的排名會隨評估方式改變。依各模型最高驗證 F1 保存權重後，測試結果為：ResNet18 accuracy 85.58%、F1 0.8963；ResNet50 accuracy 87.66%、F1 0.9097；ResNet101 accuracy 89.26%、F1 0.9207。跨模型以驗證 F1 選擇的也是 ResNet101。然而，圖 1 的逐輪最高測試準確率由 ResNet50 取得，為 93.27%。因此，本次結果支持 ResNet101 在既定驗證選模程序下表現較佳，仍不足以推論網路越深就一定越準。</w:t>
       </w:r>
       <w:r>
         <w:rPr>
           <w:rFonts w:hint="eastAsia"/>
           <w:lang w:eastAsia="zh-TW"/>
         </w:rPr>
-        <w:t>但不能肯定判斷</w:t>
       </w:r>
       <w:r>
         <w:rPr>
           <w:lang w:eastAsia="zh-TW"/>
         </w:rPr>
-        <w:t>推論網路越深就一定越準。</w:t>
       </w:r>
     </w:p>
     <w:p>
@@ -4042,11 +4040,17 @@
         </w:rPr>
       </w:pPr>
       <w:r>
-        <w:rPr>
-          <w:lang w:eastAsia="zh-TW"/>
-        </w:rPr>
-        <w:t>GitHub 儲存庫網址　待推送後填入：____________________________</w:t>
+        <w:t xml:space="preserve">GitHub 儲存庫網址　</w:t>
       </w:r>
+      <w:hyperlink r:id="rId18">
+        <w:r>
+          <w:rPr>
+            <w:color w:val="0563C1"/>
+            <w:u w:val="single"/>
+          </w:rPr>
+          <w:t>https://github.com/Fergus4506/LAB1_315553010_---</w:t>
+        </w:r>
+      </w:hyperlink>
     </w:p>
     <w:p>
       <w:pPr>

</xml_diff>